<commit_message>
Second update of portfolio
</commit_message>
<xml_diff>
--- a/public/ILERI CV2.docx
+++ b/public/ILERI CV2.docx
@@ -68,7 +68,21 @@
         <w:rPr>
           <w:rFonts w:ascii="Times New Roman" w:hAnsi="Times New Roman" w:cs="Times New Roman"/>
         </w:rPr>
-        <w:t>) Ogbeide] </w:t>
+        <w:t xml:space="preserve">) </w:t>
+      </w:r>
+      <w:proofErr w:type="spellStart"/>
+      <w:r>
+        <w:rPr>
+          <w:rFonts w:ascii="Times New Roman" w:hAnsi="Times New Roman" w:cs="Times New Roman"/>
+        </w:rPr>
+        <w:t>Ogbeide</w:t>
+      </w:r>
+      <w:proofErr w:type="spellEnd"/>
+      <w:r>
+        <w:rPr>
+          <w:rFonts w:ascii="Times New Roman" w:hAnsi="Times New Roman" w:cs="Times New Roman"/>
+        </w:rPr>
+        <w:t>] </w:t>
       </w:r>
     </w:p>
     <w:p>
@@ -165,11 +179,19 @@
           <w:rFonts w:ascii="Times New Roman" w:hAnsi="Times New Roman" w:cs="Times New Roman"/>
         </w:rPr>
       </w:pPr>
-      <w:r>
-        <w:rPr>
-          <w:rFonts w:ascii="Times New Roman" w:hAnsi="Times New Roman" w:cs="Times New Roman"/>
-        </w:rPr>
-        <w:t>Expected Graduation Date: September</w:t>
+      <w:bookmarkStart w:id="2" w:name="_GoBack"/>
+      <w:bookmarkEnd w:id="2"/>
+      <w:r>
+        <w:rPr>
+          <w:rFonts w:ascii="Times New Roman" w:hAnsi="Times New Roman" w:cs="Times New Roman"/>
+        </w:rPr>
+        <w:t xml:space="preserve">Graduation Date: </w:t>
+      </w:r>
+      <w:r>
+        <w:rPr>
+          <w:rFonts w:ascii="Times New Roman" w:hAnsi="Times New Roman" w:cs="Times New Roman"/>
+        </w:rPr>
+        <w:t>October</w:t>
       </w:r>
       <w:r>
         <w:rPr>
@@ -229,7 +251,7 @@
           <w:rFonts w:ascii="Times New Roman" w:hAnsi="Times New Roman" w:cs="Times New Roman"/>
         </w:rPr>
       </w:pPr>
-      <w:bookmarkStart w:id="2" w:name="experience"/>
+      <w:bookmarkStart w:id="3" w:name="experience"/>
       <w:bookmarkEnd w:id="1"/>
       <w:r>
         <w:rPr>
@@ -250,7 +272,7 @@
           <w:rFonts w:ascii="Times New Roman" w:hAnsi="Times New Roman" w:cs="Times New Roman"/>
         </w:rPr>
       </w:pPr>
-      <w:bookmarkStart w:id="3" w:name="X58b77d24d9116ba803d790ad0ed8e5507c52ba2"/>
+      <w:bookmarkStart w:id="4" w:name="X58b77d24d9116ba803d790ad0ed8e5507c52ba2"/>
       <w:r>
         <w:rPr>
           <w:rFonts w:ascii="Times New Roman" w:hAnsi="Times New Roman" w:cs="Times New Roman"/>
@@ -332,8 +354,8 @@
           <w:rFonts w:ascii="Times New Roman" w:hAnsi="Times New Roman" w:cs="Times New Roman"/>
         </w:rPr>
       </w:pPr>
-      <w:bookmarkStart w:id="4" w:name="founder-lip-liner-gloss-beauty-brand"/>
-      <w:bookmarkEnd w:id="3"/>
+      <w:bookmarkStart w:id="5" w:name="founder-lip-liner-gloss-beauty-brand"/>
+      <w:bookmarkEnd w:id="4"/>
       <w:r>
         <w:rPr>
           <w:rFonts w:ascii="Times New Roman" w:hAnsi="Times New Roman" w:cs="Times New Roman"/>
@@ -399,8 +421,8 @@
           <w:rFonts w:ascii="Times New Roman" w:hAnsi="Times New Roman" w:cs="Times New Roman"/>
         </w:rPr>
       </w:pPr>
-      <w:bookmarkStart w:id="5" w:name="X621fb05451291ef94c9b2d43323526fc8933da9"/>
-      <w:bookmarkEnd w:id="4"/>
+      <w:bookmarkStart w:id="6" w:name="X621fb05451291ef94c9b2d43323526fc8933da9"/>
+      <w:bookmarkEnd w:id="5"/>
       <w:r>
         <w:rPr>
           <w:rFonts w:ascii="Times New Roman" w:hAnsi="Times New Roman" w:cs="Times New Roman"/>
@@ -450,9 +472,9 @@
           <w:rFonts w:ascii="Times New Roman" w:hAnsi="Times New Roman" w:cs="Times New Roman"/>
         </w:rPr>
       </w:pPr>
-      <w:bookmarkStart w:id="6" w:name="technical-skills"/>
-      <w:bookmarkEnd w:id="2"/>
-      <w:bookmarkEnd w:id="5"/>
+      <w:bookmarkStart w:id="7" w:name="technical-skills"/>
+      <w:bookmarkEnd w:id="3"/>
+      <w:bookmarkEnd w:id="6"/>
       <w:r>
         <w:rPr>
           <w:rFonts w:ascii="Times New Roman" w:hAnsi="Times New Roman" w:cs="Times New Roman"/>
@@ -579,7 +601,19 @@
         <w:rPr>
           <w:rFonts w:ascii="Times New Roman" w:hAnsi="Times New Roman" w:cs="Times New Roman"/>
         </w:rPr>
-        <w:t xml:space="preserve">, </w:t>
+        <w:t>,</w:t>
+      </w:r>
+      <w:r>
+        <w:rPr>
+          <w:rFonts w:ascii="Times New Roman" w:hAnsi="Times New Roman" w:cs="Times New Roman"/>
+        </w:rPr>
+        <w:t xml:space="preserve"> SQL,</w:t>
+      </w:r>
+      <w:r>
+        <w:rPr>
+          <w:rFonts w:ascii="Times New Roman" w:hAnsi="Times New Roman" w:cs="Times New Roman"/>
+        </w:rPr>
+        <w:t xml:space="preserve"> </w:t>
       </w:r>
       <w:proofErr w:type="spellStart"/>
       <w:r>
@@ -681,6 +715,20 @@
           <w:rFonts w:ascii="Times New Roman" w:hAnsi="Times New Roman" w:cs="Times New Roman"/>
         </w:rPr>
         <w:t>Canva</w:t>
+      </w:r>
+      <w:proofErr w:type="spellEnd"/>
+      <w:r>
+        <w:rPr>
+          <w:rFonts w:ascii="Times New Roman" w:hAnsi="Times New Roman" w:cs="Times New Roman"/>
+        </w:rPr>
+        <w:t xml:space="preserve">, </w:t>
+      </w:r>
+      <w:proofErr w:type="spellStart"/>
+      <w:r>
+        <w:rPr>
+          <w:rFonts w:ascii="Times New Roman" w:hAnsi="Times New Roman" w:cs="Times New Roman"/>
+        </w:rPr>
+        <w:t>PhotoShop</w:t>
       </w:r>
       <w:proofErr w:type="spellEnd"/>
     </w:p>
@@ -1124,8 +1172,8 @@
           <w:rFonts w:ascii="Times New Roman" w:hAnsi="Times New Roman" w:cs="Times New Roman"/>
         </w:rPr>
       </w:pPr>
-      <w:bookmarkStart w:id="7" w:name="projects"/>
-      <w:bookmarkEnd w:id="6"/>
+      <w:bookmarkStart w:id="8" w:name="projects"/>
+      <w:bookmarkEnd w:id="7"/>
       <w:r>
         <w:rPr>
           <w:rFonts w:ascii="Times New Roman" w:hAnsi="Times New Roman" w:cs="Times New Roman"/>
@@ -1774,8 +1822,6 @@
         </w:rPr>
         <w:t>, providing users with an accessible and user-friendly platform for wine cultivar prediction.</w:t>
       </w:r>
-      <w:bookmarkStart w:id="8" w:name="_GoBack"/>
-      <w:bookmarkEnd w:id="8"/>
     </w:p>
     <w:p>
       <w:pPr>
@@ -1832,7 +1878,7 @@
         </w:rPr>
       </w:pPr>
       <w:bookmarkStart w:id="9" w:name="certifications"/>
-      <w:bookmarkEnd w:id="7"/>
+      <w:bookmarkEnd w:id="8"/>
       <w:r>
         <w:rPr>
           <w:rFonts w:ascii="Times New Roman" w:hAnsi="Times New Roman" w:cs="Times New Roman"/>
@@ -3704,6 +3750,7 @@
   <w:style w:type="character" w:default="1" w:styleId="DefaultParagraphFont">
     <w:name w:val="Default Paragraph Font"/>
     <w:uiPriority w:val="1"/>
+    <w:semiHidden/>
     <w:unhideWhenUsed/>
   </w:style>
   <w:style w:type="table" w:default="1" w:styleId="TableNormal">

</xml_diff>